<commit_message>
Sanitize public resume downloads and remove legacy source files
</commit_message>
<xml_diff>
--- a/media/Ray_Qin_Resume.docx
+++ b/media/Ray_Qin_Resume.docx
@@ -1,310 +1,299 @@
 
 <file path=word/document.xml><?xml version="1.0" encoding="utf-8"?>
-<ns0:document xmlns:ns0="http://schemas.openxmlformats.org/wordprocessingml/2006/main" xmlns:ns1="http://schemas.openxmlformats.org/markup-compatibility/2006" ns1:Ignorable="w14 wp14">
-  <ns0:body>
-    <ns0:p>
-      <ns0:pPr>
-        <ns0:pStyle ns0:val="Title"/>
-      </ns0:pPr>
-      <ns0:r>
-        <ns0:t>Ray Qin</ns0:t>
-      </ns0:r>
-    </ns0:p>
-    <ns0:p>
-      <ns0:r>
-        <ns0:rPr>
-          <ns0:b/>
-          <ns0:color ns0:val="244CDF"/>
-        </ns0:rPr>
-        <ns0:t>Senior Software Engineer | Applied AI &amp; Distributed Systems</ns0:t>
-      </ns0:r>
-    </ns0:p>
-    <ns0:p>
-      <ns0:pPr>
-        <ns0:spacing ns0:after="40"/>
-      </ns0:pPr>
-      <ns0:r>
-        <ns0:rPr>
-          <ns0:sz ns0:val="17"/>
-        </ns0:rPr>
-        <ns0:t>San Francisco Bay Area · No visa sponsorship required</ns0:t>
-      </ns0:r>
-    </ns0:p>
-    <ns0:p>
-      <ns0:pPr>
-        <ns0:spacing ns0:after="40"/>
-      </ns0:pPr>
-      <ns0:r>
-        <ns0:rPr>
-          <ns0:sz ns0:val="17"/>
-        </ns0:rPr>
-        <ns0:t>+1 415-604-6032 · qinjianxyz@gmail.com</ns0:t>
-      </ns0:r>
-    </ns0:p>
-    <ns0:p>
-      <ns0:pPr>
-        <ns0:spacing ns0:after="40"/>
-      </ns0:pPr>
-      <ns0:r>
-        <ns0:rPr>
-          <ns0:sz ns0:val="17"/>
-        </ns0:rPr>
-        <ns0:t>linkedin.com/in/qinjianxyz · qinjianxyz.github.io</ns0:t>
-      </ns0:r>
-    </ns0:p>
-    <ns0:p>
-      <ns0:pPr>
-        <ns0:pStyle ns0:val="Heading1"/>
-      </ns0:pPr>
-      <ns0:r>
-        <ns0:t>EXPERIENCE</ns0:t>
-      </ns0:r>
-    </ns0:p>
-    <ns0:p>
-      <ns0:pPr>
-        <ns0:pStyle ns0:val="Heading2"/>
-      </ns0:pPr>
-      <ns0:r>
-        <ns0:t>ZipRecruiter</ns0:t>
-      </ns0:r>
-    </ns0:p>
-    <ns0:p>
-      <ns0:pPr>
-        <ns0:keepNext/>
-      </ns0:pPr>
-      <ns0:r>
-        <ns0:rPr>
-          <ns0:sz ns0:val="17"/>
-        </ns0:rPr>
-        <ns0:t>Senior Software Engineer | Apr 2023 – Apr 2026</ns0:t>
-      </ns0:r>
-    </ns0:p>
-    <ns0:p>
-      <ns0:pPr>
-        <ns0:pStyle ns0:val="ListBullet"/>
-        <ns0:ind ns0:left="202" ns0:hanging="173"/>
-      </ns0:pPr>
-      <ns0:r>
-        <ns0:t>Rebuilt registration and authentication across 30+ entry points for 25M+ monthly job seekers, increasing login conversion by double digits and adding 10K+ weekly SMS opt-ins.</ns0:t>
-      </ns0:r>
-    </ns0:p>
-    <ns0:p>
-      <ns0:pPr>
-        <ns0:pStyle ns0:val="ListBullet"/>
-        <ns0:ind ns0:left="202" ns0:hanging="173"/>
-      </ns0:pPr>
-      <ns0:r>
-        <ns0:t>Designed shared React/Next.js and Go/gRPC authentication services for OTP and automatic login; led adoption across five product groups and retired three legacy services.</ns0:t>
-      </ns0:r>
-    </ns0:p>
-    <ns0:p>
-      <ns0:pPr>
-        <ns0:pStyle ns0:val="ListBullet"/>
-        <ns0:ind ns0:left="202" ns0:hanging="173"/>
-      </ns0:pPr>
-      <ns0:r>
-        <ns0:t>Built AI workflows to plan, implement, test, and review full-stack changes using live Jira, Slack, Notion, and GitHub context via MCP; wrote AI usage guidelines and led the company’s first Cursor workshop.</ns0:t>
-      </ns0:r>
-    </ns0:p>
-    <ns0:p>
-      <ns0:pPr>
-        <ns0:pStyle ns0:val="ListBullet"/>
-        <ns0:ind ns0:left="202" ns0:hanging="173"/>
-      </ns0:pPr>
-      <ns0:r>
-        <ns0:t>Shipped embedding-based recommendations for Suggested Jobs and More Candidates Like This, combining vector similarity search, hybrid retrieval, graph traversal, and filtering.</ns0:t>
-      </ns0:r>
-    </ns0:p>
-    <ns0:p>
-      <ns0:pPr>
-        <ns0:pStyle ns0:val="ListBullet"/>
-        <ns0:ind ns0:left="202" ns0:hanging="173"/>
-      </ns0:pPr>
-      <ns0:r>
-        <ns0:t>Reduced homepage load time by 40% through frontend and backend improvements using Next.js and Go.</ns0:t>
-      </ns0:r>
-    </ns0:p>
-    <ns0:p>
-      <ns0:pPr>
-        <ns0:pStyle ns0:val="ListBullet"/>
-        <ns0:ind ns0:left="202" ns0:hanging="173"/>
-      </ns0:pPr>
-      <ns0:r>
-        <ns0:t>Designed typed APIs with gRPC, Connect, and Protobuf; delivered company-wide talks on API design and cybersecurity.</ns0:t>
-      </ns0:r>
-    </ns0:p>
-    <ns0:p>
-      <ns0:pPr>
-        <ns0:pStyle ns0:val="Heading2"/>
-      </ns0:pPr>
-      <ns0:r>
-        <ns0:t>Eightfold</ns0:t>
-      </ns0:r>
-    </ns0:p>
-    <ns0:p>
-      <ns0:pPr>
-        <ns0:keepNext/>
-      </ns0:pPr>
-      <ns0:r>
-        <ns0:rPr>
-          <ns0:sz ns0:val="17"/>
-        </ns0:rPr>
-        <ns0:t>Software Engineer Intern | Jun 2022 – Oct 2022</ns0:t>
-      </ns0:r>
-    </ns0:p>
-    <ns0:p>
-      <ns0:pPr>
-        <ns0:pStyle ns0:val="ListBullet"/>
-        <ns0:ind ns0:left="202" ns0:hanging="173"/>
-      </ns0:pPr>
-      <ns0:r>
-        <ns0:t>Implemented atomic ETL loads, reducing data inconsistency below 2%; expanded consistency monitoring across 56 tables spanning RDS, Redshift, and Firehose pipelines.</ns0:t>
-      </ns0:r>
-    </ns0:p>
-    <ns0:p>
-      <ns0:pPr>
-        <ns0:pStyle ns0:val="ListBullet"/>
-        <ns0:ind ns0:left="202" ns0:hanging="173"/>
-      </ns0:pPr>
-      <ns0:r>
-        <ns0:t>Built a React/Flask console over EMR and S3 that reduced Spark debugging time by approximately 40%; added tests, structured logging, event tracking, and alerts.</ns0:t>
-      </ns0:r>
-    </ns0:p>
-    <ns0:p>
-      <ns0:pPr>
-        <ns0:pStyle ns0:val="Heading1"/>
-      </ns0:pPr>
-      <ns0:r>
-        <ns0:t>SELECTED PROJECTS</ns0:t>
-      </ns0:r>
-    </ns0:p>
-    <ns0:p>
-      <ns0:pPr>
-        <ns0:pStyle ns0:val="Heading2"/>
-      </ns0:pPr>
-      <ns0:r>
-        <ns0:t>Autonomous Vehicle / UC San Diego · Perception &amp; control</ns0:t>
-      </ns0:r>
-    </ns0:p>
-    <ns0:p>
-      <ns0:r>
-        <ns0:t>Built perception and control for a 1:8-scale car using Jetson Nano, ROS2, YOLOv5, and OpenCV; achieved 95%+ perception accuracy and 90%+ autonomous track completion.</ns0:t>
-      </ns0:r>
-    </ns0:p>
-    <ns0:p>
-      <ns0:pPr>
-        <ns0:pStyle ns0:val="Heading1"/>
-      </ns0:pPr>
-      <ns0:r>
-        <ns0:t>EDUCATION</ns0:t>
-      </ns0:r>
-    </ns0:p>
-    <ns0:p>
-      <ns0:pPr>
-        <ns0:pStyle ns0:val="Heading2"/>
-      </ns0:pPr>
-      <ns0:r>
-        <ns0:t>University of California, San Diego</ns0:t>
-      </ns0:r>
-    </ns0:p>
-    <ns0:p>
-      <ns0:r>
-        <ns0:t>Dual B.S., Mathematics–Computer Science and Mechanical Engineering | 2019 – 2023</ns0:t>
-      </ns0:r>
-    </ns0:p>
-    <ns0:p>
-      <ns0:r>
-        <ns0:t>Cum Laude · GPA 3.9/4.0</ns0:t>
-      </ns0:r>
-    </ns0:p>
-    <ns0:p>
-      <ns0:pPr>
-        <ns0:pStyle ns0:val="Heading1"/>
-      </ns0:pPr>
-      <ns0:r>
-        <ns0:t>TECHNICAL SKILLS</ns0:t>
-      </ns0:r>
-    </ns0:p>
-    <ns0:p>
-      <ns0:pPr>
-        <ns0:spacing ns0:after="40"/>
-      </ns0:pPr>
-      <ns0:r>
-        <ns0:rPr>
-          <ns0:b/>
-          <ns0:sz ns0:val="17"/>
-        </ns0:rPr>
-        <ns0:t xml:space="preserve">Languages: </ns0:t>
-      </ns0:r>
-      <ns0:r>
-        <ns0:rPr>
-          <ns0:sz ns0:val="17"/>
-        </ns0:rPr>
-        <ns0:t>Go, TypeScript/JavaScript, Python, SQL, C/C++, Rust, Swift</ns0:t>
-      </ns0:r>
-    </ns0:p>
-    <ns0:p>
-      <ns0:pPr>
-        <ns0:spacing ns0:after="40"/>
-      </ns0:pPr>
-      <ns0:r>
-        <ns0:rPr>
-          <ns0:b/>
-          <ns0:sz ns0:val="17"/>
-        </ns0:rPr>
-        <ns0:t xml:space="preserve">AI &amp; data: </ns0:t>
-      </ns0:r>
-      <ns0:r>
-        <ns0:rPr>
-          <ns0:sz ns0:val="17"/>
-        </ns0:rPr>
-        <ns0:t>LLM agents, MCP, RAG, evaluation, vector search, retrieval/reranking, Spark</ns0:t>
-      </ns0:r>
-    </ns0:p>
-    <ns0:p>
-      <ns0:pPr>
-        <ns0:spacing ns0:after="40"/>
-      </ns0:pPr>
-      <ns0:r>
-        <ns0:rPr>
-          <ns0:b/>
-          <ns0:sz ns0:val="17"/>
-        </ns0:rPr>
-        <ns0:t xml:space="preserve">Product &amp; systems: </ns0:t>
-      </ns0:r>
-      <ns0:r>
-        <ns0:rPr>
-          <ns0:sz ns0:val="17"/>
-        </ns0:rPr>
-        <ns0:t>React, Next.js, SwiftUI, REST, gRPC, Protobuf, authentication, distributed systems</ns0:t>
-      </ns0:r>
-    </ns0:p>
-    <ns0:p>
-      <ns0:pPr>
-        <ns0:spacing ns0:after="40"/>
-      </ns0:pPr>
-      <ns0:r>
-        <ns0:rPr>
-          <ns0:b/>
-          <ns0:sz ns0:val="17"/>
-        </ns0:rPr>
-        <ns0:t xml:space="preserve">Infrastructure: </ns0:t>
-      </ns0:r>
-      <ns0:r>
-        <ns0:rPr>
-          <ns0:sz ns0:val="17"/>
-        </ns0:rPr>
-        <ns0:t>AWS, PostgreSQL, Redis, Kafka, Docker, Kubernetes, Terraform, OpenTelemetry</ns0:t>
-      </ns0:r>
-    </ns0:p>
-    <ns0:sectPr ns0:rsidR="00FC693F" ns0:rsidRPr="0006063C" ns0:rsidSect="00034616">
-      <ns0:pgSz ns0:w="12240" ns0:h="15840"/>
-      <ns0:pgMar ns0:top="677" ns0:right="835" ns0:bottom="634" ns0:left="835" ns0:header="720" ns0:footer="720" ns0:gutter="0"/>
-      <ns0:cols ns0:space="720"/>
-      <ns0:docGrid ns0:linePitch="360"/>
-    </ns0:sectPr>
-  </ns0:body>
-</ns0:document>
+<w:document xmlns:wpc="http://schemas.microsoft.com/office/word/2010/wordprocessingCanvas" xmlns:mo="http://schemas.microsoft.com/office/mac/office/2008/main" xmlns:mc="http://schemas.openxmlformats.org/markup-compatibility/2006" xmlns:mv="urn:schemas-microsoft-com:mac:vml" xmlns:o="urn:schemas-microsoft-com:office:office" xmlns:r="http://schemas.openxmlformats.org/officeDocument/2006/relationships" xmlns:m="http://schemas.openxmlformats.org/officeDocument/2006/math" xmlns:v="urn:schemas-microsoft-com:vml" xmlns:wp14="http://schemas.microsoft.com/office/word/2010/wordprocessingDrawing" xmlns:wp="http://schemas.openxmlformats.org/drawingml/2006/wordprocessingDrawing" xmlns:w10="urn:schemas-microsoft-com:office:word" xmlns:w="http://schemas.openxmlformats.org/wordprocessingml/2006/main" xmlns:w14="http://schemas.microsoft.com/office/word/2010/wordml" xmlns:wpg="http://schemas.microsoft.com/office/word/2010/wordprocessingGroup" xmlns:wpi="http://schemas.microsoft.com/office/word/2010/wordprocessingInk" xmlns:wne="http://schemas.microsoft.com/office/word/2006/wordml" xmlns:wps="http://schemas.microsoft.com/office/word/2010/wordprocessingShape" mc:Ignorable="w14 wp14">
+  <w:body>
+    <w:p>
+      <w:pPr>
+        <w:pStyle w:val="Title"/>
+      </w:pPr>
+      <w:r>
+        <w:t>Ray Qin</w:t>
+      </w:r>
+    </w:p>
+    <w:p>
+      <w:r>
+        <w:rPr>
+          <w:b/>
+          <w:color w:val="244CDF"/>
+        </w:rPr>
+        <w:t>Senior Software Engineer | Applied AI &amp; Distributed Systems</w:t>
+      </w:r>
+    </w:p>
+    <w:p>
+      <w:pPr>
+        <w:spacing w:after="40"/>
+      </w:pPr>
+      <w:r>
+        <w:rPr>
+          <w:sz w:val="17"/>
+        </w:rPr>
+        <w:t>qinjianxyz@gmail.com</w:t>
+      </w:r>
+    </w:p>
+    <w:p>
+      <w:pPr>
+        <w:spacing w:after="40"/>
+      </w:pPr>
+      <w:r>
+        <w:rPr>
+          <w:sz w:val="17"/>
+        </w:rPr>
+        <w:t>qinjianxyz.github.io · https://t.me/rayq_ai</w:t>
+      </w:r>
+    </w:p>
+    <w:p>
+      <w:pPr>
+        <w:pStyle w:val="Heading1"/>
+      </w:pPr>
+      <w:r>
+        <w:t>EXPERIENCE</w:t>
+      </w:r>
+    </w:p>
+    <w:p>
+      <w:pPr>
+        <w:pStyle w:val="Heading2"/>
+      </w:pPr>
+      <w:r>
+        <w:t>ZipRecruiter</w:t>
+      </w:r>
+    </w:p>
+    <w:p>
+      <w:pPr>
+        <w:keepNext/>
+      </w:pPr>
+      <w:r>
+        <w:rPr>
+          <w:sz w:val="17"/>
+        </w:rPr>
+        <w:t>Senior Software Engineer | Apr 2023 – Apr 2026</w:t>
+      </w:r>
+    </w:p>
+    <w:p>
+      <w:pPr>
+        <w:pStyle w:val="ListBullet"/>
+        <w:ind w:left="202" w:hanging="173"/>
+      </w:pPr>
+      <w:r>
+        <w:t>Rebuilt registration and authentication across 30+ entry points for 25M+ monthly job seekers, increasing login conversion by double digits and adding 10K+ weekly SMS opt-ins.</w:t>
+      </w:r>
+    </w:p>
+    <w:p>
+      <w:pPr>
+        <w:pStyle w:val="ListBullet"/>
+        <w:ind w:left="202" w:hanging="173"/>
+      </w:pPr>
+      <w:r>
+        <w:t>Designed shared React/Next.js and Go/gRPC authentication services for OTP and automatic login; led adoption across five product groups and retired three legacy services.</w:t>
+      </w:r>
+    </w:p>
+    <w:p>
+      <w:pPr>
+        <w:pStyle w:val="ListBullet"/>
+        <w:ind w:left="202" w:hanging="173"/>
+      </w:pPr>
+      <w:r>
+        <w:t>Built AI workflows to plan, implement, test, and review full-stack changes using live Jira, Slack, Notion, and GitHub context via MCP; wrote AI usage guidelines and led the company’s first Cursor workshop.</w:t>
+      </w:r>
+    </w:p>
+    <w:p>
+      <w:pPr>
+        <w:pStyle w:val="ListBullet"/>
+        <w:ind w:left="202" w:hanging="173"/>
+      </w:pPr>
+      <w:r>
+        <w:t>Shipped embedding-based recommendations for Suggested Jobs and More Candidates Like This, combining vector similarity search, hybrid retrieval, graph traversal, and filtering.</w:t>
+      </w:r>
+    </w:p>
+    <w:p>
+      <w:pPr>
+        <w:pStyle w:val="ListBullet"/>
+        <w:ind w:left="202" w:hanging="173"/>
+      </w:pPr>
+      <w:r>
+        <w:t>Reduced homepage load time by 40% through frontend and backend improvements using Next.js and Go.</w:t>
+      </w:r>
+    </w:p>
+    <w:p>
+      <w:pPr>
+        <w:pStyle w:val="ListBullet"/>
+        <w:ind w:left="202" w:hanging="173"/>
+      </w:pPr>
+      <w:r>
+        <w:t>Designed typed APIs with gRPC, Connect, and Protobuf; delivered company-wide talks on API design and cybersecurity.</w:t>
+      </w:r>
+    </w:p>
+    <w:p>
+      <w:pPr>
+        <w:pStyle w:val="Heading2"/>
+      </w:pPr>
+      <w:r>
+        <w:t>Eightfold</w:t>
+      </w:r>
+    </w:p>
+    <w:p>
+      <w:pPr>
+        <w:keepNext/>
+      </w:pPr>
+      <w:r>
+        <w:rPr>
+          <w:sz w:val="17"/>
+        </w:rPr>
+        <w:t>Software Engineer Intern | Jun 2022 – Oct 2022</w:t>
+      </w:r>
+    </w:p>
+    <w:p>
+      <w:pPr>
+        <w:pStyle w:val="ListBullet"/>
+        <w:ind w:left="202" w:hanging="173"/>
+      </w:pPr>
+      <w:r>
+        <w:t>Implemented atomic ETL loads, reducing data inconsistency below 2%; expanded consistency monitoring across 56 tables spanning RDS, Redshift, and Firehose pipelines.</w:t>
+      </w:r>
+    </w:p>
+    <w:p>
+      <w:pPr>
+        <w:pStyle w:val="ListBullet"/>
+        <w:ind w:left="202" w:hanging="173"/>
+      </w:pPr>
+      <w:r>
+        <w:t>Built a React/Flask console over EMR and S3 that reduced Spark debugging time by approximately 40%; added tests, structured logging, event tracking, and alerts.</w:t>
+      </w:r>
+    </w:p>
+    <w:p>
+      <w:pPr>
+        <w:pStyle w:val="Heading1"/>
+      </w:pPr>
+      <w:r>
+        <w:t>SELECTED PROJECTS</w:t>
+      </w:r>
+    </w:p>
+    <w:p>
+      <w:pPr>
+        <w:pStyle w:val="Heading2"/>
+      </w:pPr>
+      <w:r>
+        <w:t>Autonomous Vehicle / UC San Diego · Perception &amp; control</w:t>
+      </w:r>
+    </w:p>
+    <w:p>
+      <w:r>
+        <w:t>Built perception and control for a 1:8-scale car using Jetson Nano, ROS2, YOLOv5, and OpenCV; achieved 95%+ perception accuracy and 90%+ autonomous track completion.</w:t>
+      </w:r>
+    </w:p>
+    <w:p>
+      <w:pPr>
+        <w:pStyle w:val="Heading1"/>
+      </w:pPr>
+      <w:r>
+        <w:t>EDUCATION</w:t>
+      </w:r>
+    </w:p>
+    <w:p>
+      <w:pPr>
+        <w:pStyle w:val="Heading2"/>
+      </w:pPr>
+      <w:r>
+        <w:t>University of California, San Diego</w:t>
+      </w:r>
+    </w:p>
+    <w:p>
+      <w:r>
+        <w:t>Dual B.S., Mathematics–Computer Science and Mechanical Engineering | 2019 – 2023</w:t>
+      </w:r>
+    </w:p>
+    <w:p>
+      <w:r>
+        <w:t>Cum Laude · GPA 3.9/4.0</w:t>
+      </w:r>
+    </w:p>
+    <w:p>
+      <w:pPr>
+        <w:pStyle w:val="Heading1"/>
+      </w:pPr>
+      <w:r>
+        <w:t>TECHNICAL SKILLS</w:t>
+      </w:r>
+    </w:p>
+    <w:p>
+      <w:pPr>
+        <w:spacing w:after="40"/>
+      </w:pPr>
+      <w:r>
+        <w:rPr>
+          <w:b/>
+          <w:sz w:val="17"/>
+        </w:rPr>
+        <w:t xml:space="preserve">Languages: </w:t>
+      </w:r>
+      <w:r>
+        <w:rPr>
+          <w:sz w:val="17"/>
+        </w:rPr>
+        <w:t>Go, TypeScript/JavaScript, Python, SQL, C/C++, Rust, Swift</w:t>
+      </w:r>
+    </w:p>
+    <w:p>
+      <w:pPr>
+        <w:spacing w:after="40"/>
+      </w:pPr>
+      <w:r>
+        <w:rPr>
+          <w:b/>
+          <w:sz w:val="17"/>
+        </w:rPr>
+        <w:t xml:space="preserve">AI &amp; data: </w:t>
+      </w:r>
+      <w:r>
+        <w:rPr>
+          <w:sz w:val="17"/>
+        </w:rPr>
+        <w:t>LLM agents, MCP, RAG, evaluation, vector search, retrieval/reranking, Spark</w:t>
+      </w:r>
+    </w:p>
+    <w:p>
+      <w:pPr>
+        <w:spacing w:after="40"/>
+      </w:pPr>
+      <w:r>
+        <w:rPr>
+          <w:b/>
+          <w:sz w:val="17"/>
+        </w:rPr>
+        <w:t xml:space="preserve">Product &amp; systems: </w:t>
+      </w:r>
+      <w:r>
+        <w:rPr>
+          <w:sz w:val="17"/>
+        </w:rPr>
+        <w:t>React, Next.js, SwiftUI, REST, gRPC, Protobuf, authentication, distributed systems</w:t>
+      </w:r>
+    </w:p>
+    <w:p>
+      <w:pPr>
+        <w:spacing w:after="40"/>
+      </w:pPr>
+      <w:r>
+        <w:rPr>
+          <w:b/>
+          <w:sz w:val="17"/>
+        </w:rPr>
+        <w:t xml:space="preserve">Infrastructure: </w:t>
+      </w:r>
+      <w:r>
+        <w:rPr>
+          <w:sz w:val="17"/>
+        </w:rPr>
+        <w:t>AWS, PostgreSQL, Redis, Kafka, Docker, Kubernetes, Terraform, OpenTelemetry</w:t>
+      </w:r>
+    </w:p>
+    <w:sectPr>
+      <w:pgSz w:w="12240" w:h="15840"/>
+      <w:pgMar w:top="677" w:right="835" w:bottom="634" w:left="835" w:header="720" w:footer="720" w:gutter="0"/>
+      <w:cols w:space="720"/>
+      <w:docGrid w:linePitch="360"/>
+    </w:sectPr>
+  </w:body>
+</w:document>
 </file>
 
 <file path=word/numbering.xml><?xml version="1.0" encoding="utf-8"?>

</xml_diff>

<commit_message>
Sanitize public resume downloads and remove legacy source files (#57)
</commit_message>
<xml_diff>
--- a/media/Ray_Qin_Resume.docx
+++ b/media/Ray_Qin_Resume.docx
@@ -1,310 +1,299 @@
 
 <file path=word/document.xml><?xml version="1.0" encoding="utf-8"?>
-<ns0:document xmlns:ns0="http://schemas.openxmlformats.org/wordprocessingml/2006/main" xmlns:ns1="http://schemas.openxmlformats.org/markup-compatibility/2006" ns1:Ignorable="w14 wp14">
-  <ns0:body>
-    <ns0:p>
-      <ns0:pPr>
-        <ns0:pStyle ns0:val="Title"/>
-      </ns0:pPr>
-      <ns0:r>
-        <ns0:t>Ray Qin</ns0:t>
-      </ns0:r>
-    </ns0:p>
-    <ns0:p>
-      <ns0:r>
-        <ns0:rPr>
-          <ns0:b/>
-          <ns0:color ns0:val="244CDF"/>
-        </ns0:rPr>
-        <ns0:t>Senior Software Engineer | Applied AI &amp; Distributed Systems</ns0:t>
-      </ns0:r>
-    </ns0:p>
-    <ns0:p>
-      <ns0:pPr>
-        <ns0:spacing ns0:after="40"/>
-      </ns0:pPr>
-      <ns0:r>
-        <ns0:rPr>
-          <ns0:sz ns0:val="17"/>
-        </ns0:rPr>
-        <ns0:t>San Francisco Bay Area · No visa sponsorship required</ns0:t>
-      </ns0:r>
-    </ns0:p>
-    <ns0:p>
-      <ns0:pPr>
-        <ns0:spacing ns0:after="40"/>
-      </ns0:pPr>
-      <ns0:r>
-        <ns0:rPr>
-          <ns0:sz ns0:val="17"/>
-        </ns0:rPr>
-        <ns0:t>+1 415-604-6032 · qinjianxyz@gmail.com</ns0:t>
-      </ns0:r>
-    </ns0:p>
-    <ns0:p>
-      <ns0:pPr>
-        <ns0:spacing ns0:after="40"/>
-      </ns0:pPr>
-      <ns0:r>
-        <ns0:rPr>
-          <ns0:sz ns0:val="17"/>
-        </ns0:rPr>
-        <ns0:t>linkedin.com/in/qinjianxyz · qinjianxyz.github.io</ns0:t>
-      </ns0:r>
-    </ns0:p>
-    <ns0:p>
-      <ns0:pPr>
-        <ns0:pStyle ns0:val="Heading1"/>
-      </ns0:pPr>
-      <ns0:r>
-        <ns0:t>EXPERIENCE</ns0:t>
-      </ns0:r>
-    </ns0:p>
-    <ns0:p>
-      <ns0:pPr>
-        <ns0:pStyle ns0:val="Heading2"/>
-      </ns0:pPr>
-      <ns0:r>
-        <ns0:t>ZipRecruiter</ns0:t>
-      </ns0:r>
-    </ns0:p>
-    <ns0:p>
-      <ns0:pPr>
-        <ns0:keepNext/>
-      </ns0:pPr>
-      <ns0:r>
-        <ns0:rPr>
-          <ns0:sz ns0:val="17"/>
-        </ns0:rPr>
-        <ns0:t>Senior Software Engineer | Apr 2023 – Apr 2026</ns0:t>
-      </ns0:r>
-    </ns0:p>
-    <ns0:p>
-      <ns0:pPr>
-        <ns0:pStyle ns0:val="ListBullet"/>
-        <ns0:ind ns0:left="202" ns0:hanging="173"/>
-      </ns0:pPr>
-      <ns0:r>
-        <ns0:t>Rebuilt registration and authentication across 30+ entry points for 25M+ monthly job seekers, increasing login conversion by double digits and adding 10K+ weekly SMS opt-ins.</ns0:t>
-      </ns0:r>
-    </ns0:p>
-    <ns0:p>
-      <ns0:pPr>
-        <ns0:pStyle ns0:val="ListBullet"/>
-        <ns0:ind ns0:left="202" ns0:hanging="173"/>
-      </ns0:pPr>
-      <ns0:r>
-        <ns0:t>Designed shared React/Next.js and Go/gRPC authentication services for OTP and automatic login; led adoption across five product groups and retired three legacy services.</ns0:t>
-      </ns0:r>
-    </ns0:p>
-    <ns0:p>
-      <ns0:pPr>
-        <ns0:pStyle ns0:val="ListBullet"/>
-        <ns0:ind ns0:left="202" ns0:hanging="173"/>
-      </ns0:pPr>
-      <ns0:r>
-        <ns0:t>Built AI workflows to plan, implement, test, and review full-stack changes using live Jira, Slack, Notion, and GitHub context via MCP; wrote AI usage guidelines and led the company’s first Cursor workshop.</ns0:t>
-      </ns0:r>
-    </ns0:p>
-    <ns0:p>
-      <ns0:pPr>
-        <ns0:pStyle ns0:val="ListBullet"/>
-        <ns0:ind ns0:left="202" ns0:hanging="173"/>
-      </ns0:pPr>
-      <ns0:r>
-        <ns0:t>Shipped embedding-based recommendations for Suggested Jobs and More Candidates Like This, combining vector similarity search, hybrid retrieval, graph traversal, and filtering.</ns0:t>
-      </ns0:r>
-    </ns0:p>
-    <ns0:p>
-      <ns0:pPr>
-        <ns0:pStyle ns0:val="ListBullet"/>
-        <ns0:ind ns0:left="202" ns0:hanging="173"/>
-      </ns0:pPr>
-      <ns0:r>
-        <ns0:t>Reduced homepage load time by 40% through frontend and backend improvements using Next.js and Go.</ns0:t>
-      </ns0:r>
-    </ns0:p>
-    <ns0:p>
-      <ns0:pPr>
-        <ns0:pStyle ns0:val="ListBullet"/>
-        <ns0:ind ns0:left="202" ns0:hanging="173"/>
-      </ns0:pPr>
-      <ns0:r>
-        <ns0:t>Designed typed APIs with gRPC, Connect, and Protobuf; delivered company-wide talks on API design and cybersecurity.</ns0:t>
-      </ns0:r>
-    </ns0:p>
-    <ns0:p>
-      <ns0:pPr>
-        <ns0:pStyle ns0:val="Heading2"/>
-      </ns0:pPr>
-      <ns0:r>
-        <ns0:t>Eightfold</ns0:t>
-      </ns0:r>
-    </ns0:p>
-    <ns0:p>
-      <ns0:pPr>
-        <ns0:keepNext/>
-      </ns0:pPr>
-      <ns0:r>
-        <ns0:rPr>
-          <ns0:sz ns0:val="17"/>
-        </ns0:rPr>
-        <ns0:t>Software Engineer Intern | Jun 2022 – Oct 2022</ns0:t>
-      </ns0:r>
-    </ns0:p>
-    <ns0:p>
-      <ns0:pPr>
-        <ns0:pStyle ns0:val="ListBullet"/>
-        <ns0:ind ns0:left="202" ns0:hanging="173"/>
-      </ns0:pPr>
-      <ns0:r>
-        <ns0:t>Implemented atomic ETL loads, reducing data inconsistency below 2%; expanded consistency monitoring across 56 tables spanning RDS, Redshift, and Firehose pipelines.</ns0:t>
-      </ns0:r>
-    </ns0:p>
-    <ns0:p>
-      <ns0:pPr>
-        <ns0:pStyle ns0:val="ListBullet"/>
-        <ns0:ind ns0:left="202" ns0:hanging="173"/>
-      </ns0:pPr>
-      <ns0:r>
-        <ns0:t>Built a React/Flask console over EMR and S3 that reduced Spark debugging time by approximately 40%; added tests, structured logging, event tracking, and alerts.</ns0:t>
-      </ns0:r>
-    </ns0:p>
-    <ns0:p>
-      <ns0:pPr>
-        <ns0:pStyle ns0:val="Heading1"/>
-      </ns0:pPr>
-      <ns0:r>
-        <ns0:t>SELECTED PROJECTS</ns0:t>
-      </ns0:r>
-    </ns0:p>
-    <ns0:p>
-      <ns0:pPr>
-        <ns0:pStyle ns0:val="Heading2"/>
-      </ns0:pPr>
-      <ns0:r>
-        <ns0:t>Autonomous Vehicle / UC San Diego · Perception &amp; control</ns0:t>
-      </ns0:r>
-    </ns0:p>
-    <ns0:p>
-      <ns0:r>
-        <ns0:t>Built perception and control for a 1:8-scale car using Jetson Nano, ROS2, YOLOv5, and OpenCV; achieved 95%+ perception accuracy and 90%+ autonomous track completion.</ns0:t>
-      </ns0:r>
-    </ns0:p>
-    <ns0:p>
-      <ns0:pPr>
-        <ns0:pStyle ns0:val="Heading1"/>
-      </ns0:pPr>
-      <ns0:r>
-        <ns0:t>EDUCATION</ns0:t>
-      </ns0:r>
-    </ns0:p>
-    <ns0:p>
-      <ns0:pPr>
-        <ns0:pStyle ns0:val="Heading2"/>
-      </ns0:pPr>
-      <ns0:r>
-        <ns0:t>University of California, San Diego</ns0:t>
-      </ns0:r>
-    </ns0:p>
-    <ns0:p>
-      <ns0:r>
-        <ns0:t>Dual B.S., Mathematics–Computer Science and Mechanical Engineering | 2019 – 2023</ns0:t>
-      </ns0:r>
-    </ns0:p>
-    <ns0:p>
-      <ns0:r>
-        <ns0:t>Cum Laude · GPA 3.9/4.0</ns0:t>
-      </ns0:r>
-    </ns0:p>
-    <ns0:p>
-      <ns0:pPr>
-        <ns0:pStyle ns0:val="Heading1"/>
-      </ns0:pPr>
-      <ns0:r>
-        <ns0:t>TECHNICAL SKILLS</ns0:t>
-      </ns0:r>
-    </ns0:p>
-    <ns0:p>
-      <ns0:pPr>
-        <ns0:spacing ns0:after="40"/>
-      </ns0:pPr>
-      <ns0:r>
-        <ns0:rPr>
-          <ns0:b/>
-          <ns0:sz ns0:val="17"/>
-        </ns0:rPr>
-        <ns0:t xml:space="preserve">Languages: </ns0:t>
-      </ns0:r>
-      <ns0:r>
-        <ns0:rPr>
-          <ns0:sz ns0:val="17"/>
-        </ns0:rPr>
-        <ns0:t>Go, TypeScript/JavaScript, Python, SQL, C/C++, Rust, Swift</ns0:t>
-      </ns0:r>
-    </ns0:p>
-    <ns0:p>
-      <ns0:pPr>
-        <ns0:spacing ns0:after="40"/>
-      </ns0:pPr>
-      <ns0:r>
-        <ns0:rPr>
-          <ns0:b/>
-          <ns0:sz ns0:val="17"/>
-        </ns0:rPr>
-        <ns0:t xml:space="preserve">AI &amp; data: </ns0:t>
-      </ns0:r>
-      <ns0:r>
-        <ns0:rPr>
-          <ns0:sz ns0:val="17"/>
-        </ns0:rPr>
-        <ns0:t>LLM agents, MCP, RAG, evaluation, vector search, retrieval/reranking, Spark</ns0:t>
-      </ns0:r>
-    </ns0:p>
-    <ns0:p>
-      <ns0:pPr>
-        <ns0:spacing ns0:after="40"/>
-      </ns0:pPr>
-      <ns0:r>
-        <ns0:rPr>
-          <ns0:b/>
-          <ns0:sz ns0:val="17"/>
-        </ns0:rPr>
-        <ns0:t xml:space="preserve">Product &amp; systems: </ns0:t>
-      </ns0:r>
-      <ns0:r>
-        <ns0:rPr>
-          <ns0:sz ns0:val="17"/>
-        </ns0:rPr>
-        <ns0:t>React, Next.js, SwiftUI, REST, gRPC, Protobuf, authentication, distributed systems</ns0:t>
-      </ns0:r>
-    </ns0:p>
-    <ns0:p>
-      <ns0:pPr>
-        <ns0:spacing ns0:after="40"/>
-      </ns0:pPr>
-      <ns0:r>
-        <ns0:rPr>
-          <ns0:b/>
-          <ns0:sz ns0:val="17"/>
-        </ns0:rPr>
-        <ns0:t xml:space="preserve">Infrastructure: </ns0:t>
-      </ns0:r>
-      <ns0:r>
-        <ns0:rPr>
-          <ns0:sz ns0:val="17"/>
-        </ns0:rPr>
-        <ns0:t>AWS, PostgreSQL, Redis, Kafka, Docker, Kubernetes, Terraform, OpenTelemetry</ns0:t>
-      </ns0:r>
-    </ns0:p>
-    <ns0:sectPr ns0:rsidR="00FC693F" ns0:rsidRPr="0006063C" ns0:rsidSect="00034616">
-      <ns0:pgSz ns0:w="12240" ns0:h="15840"/>
-      <ns0:pgMar ns0:top="677" ns0:right="835" ns0:bottom="634" ns0:left="835" ns0:header="720" ns0:footer="720" ns0:gutter="0"/>
-      <ns0:cols ns0:space="720"/>
-      <ns0:docGrid ns0:linePitch="360"/>
-    </ns0:sectPr>
-  </ns0:body>
-</ns0:document>
+<w:document xmlns:wpc="http://schemas.microsoft.com/office/word/2010/wordprocessingCanvas" xmlns:mo="http://schemas.microsoft.com/office/mac/office/2008/main" xmlns:mc="http://schemas.openxmlformats.org/markup-compatibility/2006" xmlns:mv="urn:schemas-microsoft-com:mac:vml" xmlns:o="urn:schemas-microsoft-com:office:office" xmlns:r="http://schemas.openxmlformats.org/officeDocument/2006/relationships" xmlns:m="http://schemas.openxmlformats.org/officeDocument/2006/math" xmlns:v="urn:schemas-microsoft-com:vml" xmlns:wp14="http://schemas.microsoft.com/office/word/2010/wordprocessingDrawing" xmlns:wp="http://schemas.openxmlformats.org/drawingml/2006/wordprocessingDrawing" xmlns:w10="urn:schemas-microsoft-com:office:word" xmlns:w="http://schemas.openxmlformats.org/wordprocessingml/2006/main" xmlns:w14="http://schemas.microsoft.com/office/word/2010/wordml" xmlns:wpg="http://schemas.microsoft.com/office/word/2010/wordprocessingGroup" xmlns:wpi="http://schemas.microsoft.com/office/word/2010/wordprocessingInk" xmlns:wne="http://schemas.microsoft.com/office/word/2006/wordml" xmlns:wps="http://schemas.microsoft.com/office/word/2010/wordprocessingShape" mc:Ignorable="w14 wp14">
+  <w:body>
+    <w:p>
+      <w:pPr>
+        <w:pStyle w:val="Title"/>
+      </w:pPr>
+      <w:r>
+        <w:t>Ray Qin</w:t>
+      </w:r>
+    </w:p>
+    <w:p>
+      <w:r>
+        <w:rPr>
+          <w:b/>
+          <w:color w:val="244CDF"/>
+        </w:rPr>
+        <w:t>Senior Software Engineer | Applied AI &amp; Distributed Systems</w:t>
+      </w:r>
+    </w:p>
+    <w:p>
+      <w:pPr>
+        <w:spacing w:after="40"/>
+      </w:pPr>
+      <w:r>
+        <w:rPr>
+          <w:sz w:val="17"/>
+        </w:rPr>
+        <w:t>qinjianxyz@gmail.com</w:t>
+      </w:r>
+    </w:p>
+    <w:p>
+      <w:pPr>
+        <w:spacing w:after="40"/>
+      </w:pPr>
+      <w:r>
+        <w:rPr>
+          <w:sz w:val="17"/>
+        </w:rPr>
+        <w:t>qinjianxyz.github.io · https://t.me/rayq_ai</w:t>
+      </w:r>
+    </w:p>
+    <w:p>
+      <w:pPr>
+        <w:pStyle w:val="Heading1"/>
+      </w:pPr>
+      <w:r>
+        <w:t>EXPERIENCE</w:t>
+      </w:r>
+    </w:p>
+    <w:p>
+      <w:pPr>
+        <w:pStyle w:val="Heading2"/>
+      </w:pPr>
+      <w:r>
+        <w:t>ZipRecruiter</w:t>
+      </w:r>
+    </w:p>
+    <w:p>
+      <w:pPr>
+        <w:keepNext/>
+      </w:pPr>
+      <w:r>
+        <w:rPr>
+          <w:sz w:val="17"/>
+        </w:rPr>
+        <w:t>Senior Software Engineer | Apr 2023 – Apr 2026</w:t>
+      </w:r>
+    </w:p>
+    <w:p>
+      <w:pPr>
+        <w:pStyle w:val="ListBullet"/>
+        <w:ind w:left="202" w:hanging="173"/>
+      </w:pPr>
+      <w:r>
+        <w:t>Rebuilt registration and authentication across 30+ entry points for 25M+ monthly job seekers, increasing login conversion by double digits and adding 10K+ weekly SMS opt-ins.</w:t>
+      </w:r>
+    </w:p>
+    <w:p>
+      <w:pPr>
+        <w:pStyle w:val="ListBullet"/>
+        <w:ind w:left="202" w:hanging="173"/>
+      </w:pPr>
+      <w:r>
+        <w:t>Designed shared React/Next.js and Go/gRPC authentication services for OTP and automatic login; led adoption across five product groups and retired three legacy services.</w:t>
+      </w:r>
+    </w:p>
+    <w:p>
+      <w:pPr>
+        <w:pStyle w:val="ListBullet"/>
+        <w:ind w:left="202" w:hanging="173"/>
+      </w:pPr>
+      <w:r>
+        <w:t>Built AI workflows to plan, implement, test, and review full-stack changes using live Jira, Slack, Notion, and GitHub context via MCP; wrote AI usage guidelines and led the company’s first Cursor workshop.</w:t>
+      </w:r>
+    </w:p>
+    <w:p>
+      <w:pPr>
+        <w:pStyle w:val="ListBullet"/>
+        <w:ind w:left="202" w:hanging="173"/>
+      </w:pPr>
+      <w:r>
+        <w:t>Shipped embedding-based recommendations for Suggested Jobs and More Candidates Like This, combining vector similarity search, hybrid retrieval, graph traversal, and filtering.</w:t>
+      </w:r>
+    </w:p>
+    <w:p>
+      <w:pPr>
+        <w:pStyle w:val="ListBullet"/>
+        <w:ind w:left="202" w:hanging="173"/>
+      </w:pPr>
+      <w:r>
+        <w:t>Reduced homepage load time by 40% through frontend and backend improvements using Next.js and Go.</w:t>
+      </w:r>
+    </w:p>
+    <w:p>
+      <w:pPr>
+        <w:pStyle w:val="ListBullet"/>
+        <w:ind w:left="202" w:hanging="173"/>
+      </w:pPr>
+      <w:r>
+        <w:t>Designed typed APIs with gRPC, Connect, and Protobuf; delivered company-wide talks on API design and cybersecurity.</w:t>
+      </w:r>
+    </w:p>
+    <w:p>
+      <w:pPr>
+        <w:pStyle w:val="Heading2"/>
+      </w:pPr>
+      <w:r>
+        <w:t>Eightfold</w:t>
+      </w:r>
+    </w:p>
+    <w:p>
+      <w:pPr>
+        <w:keepNext/>
+      </w:pPr>
+      <w:r>
+        <w:rPr>
+          <w:sz w:val="17"/>
+        </w:rPr>
+        <w:t>Software Engineer Intern | Jun 2022 – Oct 2022</w:t>
+      </w:r>
+    </w:p>
+    <w:p>
+      <w:pPr>
+        <w:pStyle w:val="ListBullet"/>
+        <w:ind w:left="202" w:hanging="173"/>
+      </w:pPr>
+      <w:r>
+        <w:t>Implemented atomic ETL loads, reducing data inconsistency below 2%; expanded consistency monitoring across 56 tables spanning RDS, Redshift, and Firehose pipelines.</w:t>
+      </w:r>
+    </w:p>
+    <w:p>
+      <w:pPr>
+        <w:pStyle w:val="ListBullet"/>
+        <w:ind w:left="202" w:hanging="173"/>
+      </w:pPr>
+      <w:r>
+        <w:t>Built a React/Flask console over EMR and S3 that reduced Spark debugging time by approximately 40%; added tests, structured logging, event tracking, and alerts.</w:t>
+      </w:r>
+    </w:p>
+    <w:p>
+      <w:pPr>
+        <w:pStyle w:val="Heading1"/>
+      </w:pPr>
+      <w:r>
+        <w:t>SELECTED PROJECTS</w:t>
+      </w:r>
+    </w:p>
+    <w:p>
+      <w:pPr>
+        <w:pStyle w:val="Heading2"/>
+      </w:pPr>
+      <w:r>
+        <w:t>Autonomous Vehicle / UC San Diego · Perception &amp; control</w:t>
+      </w:r>
+    </w:p>
+    <w:p>
+      <w:r>
+        <w:t>Built perception and control for a 1:8-scale car using Jetson Nano, ROS2, YOLOv5, and OpenCV; achieved 95%+ perception accuracy and 90%+ autonomous track completion.</w:t>
+      </w:r>
+    </w:p>
+    <w:p>
+      <w:pPr>
+        <w:pStyle w:val="Heading1"/>
+      </w:pPr>
+      <w:r>
+        <w:t>EDUCATION</w:t>
+      </w:r>
+    </w:p>
+    <w:p>
+      <w:pPr>
+        <w:pStyle w:val="Heading2"/>
+      </w:pPr>
+      <w:r>
+        <w:t>University of California, San Diego</w:t>
+      </w:r>
+    </w:p>
+    <w:p>
+      <w:r>
+        <w:t>Dual B.S., Mathematics–Computer Science and Mechanical Engineering | 2019 – 2023</w:t>
+      </w:r>
+    </w:p>
+    <w:p>
+      <w:r>
+        <w:t>Cum Laude · GPA 3.9/4.0</w:t>
+      </w:r>
+    </w:p>
+    <w:p>
+      <w:pPr>
+        <w:pStyle w:val="Heading1"/>
+      </w:pPr>
+      <w:r>
+        <w:t>TECHNICAL SKILLS</w:t>
+      </w:r>
+    </w:p>
+    <w:p>
+      <w:pPr>
+        <w:spacing w:after="40"/>
+      </w:pPr>
+      <w:r>
+        <w:rPr>
+          <w:b/>
+          <w:sz w:val="17"/>
+        </w:rPr>
+        <w:t xml:space="preserve">Languages: </w:t>
+      </w:r>
+      <w:r>
+        <w:rPr>
+          <w:sz w:val="17"/>
+        </w:rPr>
+        <w:t>Go, TypeScript/JavaScript, Python, SQL, C/C++, Rust, Swift</w:t>
+      </w:r>
+    </w:p>
+    <w:p>
+      <w:pPr>
+        <w:spacing w:after="40"/>
+      </w:pPr>
+      <w:r>
+        <w:rPr>
+          <w:b/>
+          <w:sz w:val="17"/>
+        </w:rPr>
+        <w:t xml:space="preserve">AI &amp; data: </w:t>
+      </w:r>
+      <w:r>
+        <w:rPr>
+          <w:sz w:val="17"/>
+        </w:rPr>
+        <w:t>LLM agents, MCP, RAG, evaluation, vector search, retrieval/reranking, Spark</w:t>
+      </w:r>
+    </w:p>
+    <w:p>
+      <w:pPr>
+        <w:spacing w:after="40"/>
+      </w:pPr>
+      <w:r>
+        <w:rPr>
+          <w:b/>
+          <w:sz w:val="17"/>
+        </w:rPr>
+        <w:t xml:space="preserve">Product &amp; systems: </w:t>
+      </w:r>
+      <w:r>
+        <w:rPr>
+          <w:sz w:val="17"/>
+        </w:rPr>
+        <w:t>React, Next.js, SwiftUI, REST, gRPC, Protobuf, authentication, distributed systems</w:t>
+      </w:r>
+    </w:p>
+    <w:p>
+      <w:pPr>
+        <w:spacing w:after="40"/>
+      </w:pPr>
+      <w:r>
+        <w:rPr>
+          <w:b/>
+          <w:sz w:val="17"/>
+        </w:rPr>
+        <w:t xml:space="preserve">Infrastructure: </w:t>
+      </w:r>
+      <w:r>
+        <w:rPr>
+          <w:sz w:val="17"/>
+        </w:rPr>
+        <w:t>AWS, PostgreSQL, Redis, Kafka, Docker, Kubernetes, Terraform, OpenTelemetry</w:t>
+      </w:r>
+    </w:p>
+    <w:sectPr>
+      <w:pgSz w:w="12240" w:h="15840"/>
+      <w:pgMar w:top="677" w:right="835" w:bottom="634" w:left="835" w:header="720" w:footer="720" w:gutter="0"/>
+      <w:cols w:space="720"/>
+      <w:docGrid w:linePitch="360"/>
+    </w:sectPr>
+  </w:body>
+</w:document>
 </file>
 
 <file path=word/numbering.xml><?xml version="1.0" encoding="utf-8"?>

</xml_diff>